<commit_message>
Reword ICE notice as Industrial Advisory Panel meeting
Use the same agenda and wording as the Textile Engineering IAP notice.

Co-Authored-By: Claude Opus 5.5 <noreply@anthropic.com>
Claude-Session: https://claude.ai/code/session_01ELaQ6vS1YNg97XUU7RUmR3
</commit_message>
<xml_diff>
--- a/ICE_Department_Meetings/2025-04-20/ICE_Department_Meeting_Notice_20.04.2025.docx
+++ b/ICE_Department_Meetings/2025-04-20/ICE_Department_Meeting_Notice_20.04.2025.docx
@@ -95,7 +95,7 @@
           <w:sz w:val="24"/>
           <w:u w:val="none"/>
         </w:rPr>
-        <w:t>Meeting of the Department of ICE</w:t>
+        <w:t>Meeting with Industrial Advisory Panel</w:t>
       </w:r>
     </w:p>
     <w:p>
@@ -137,7 +137,7 @@
           <w:sz w:val="24"/>
           <w:u w:val="none"/>
         </w:rPr>
-        <w:t>All respected faculty members of the Department of Information and Communication Engineering (ICE) are hereby informed that a departmental meeting will be held as per the following schedule:</w:t>
+        <w:t>All respected members of the Industrial Advisory Panel are hereby informed that a meeting will be held as per the following schedule:</w:t>
       </w:r>
     </w:p>
     <w:tbl>
@@ -230,7 +230,7 @@
         <w:t>Meeting Agenda:</w:t>
       </w:r>
       <w:r>
-        <w:t xml:space="preserve"> The meeting will discuss the following important issues-</w:t>
+        <w:t xml:space="preserve"> The meeting will discuss important issues-</w:t>
       </w:r>
     </w:p>
     <w:p>
@@ -249,7 +249,7 @@
         </w:rPr>
         <w:t>1.</w:t>
         <w:tab/>
-        <w:t>Lab Assessment Report submission</w:t>
+        <w:t>Curriculum development</w:t>
       </w:r>
     </w:p>
     <w:p>
@@ -268,7 +268,7 @@
         </w:rPr>
         <w:t>2.</w:t>
         <w:tab/>
-        <w:t>Inclusion of new topics in the Computer Fundamentals course</w:t>
+        <w:t>Industrial visit</w:t>
       </w:r>
     </w:p>
     <w:p>
@@ -287,7 +287,7 @@
         </w:rPr>
         <w:t>3.</w:t>
         <w:tab/>
-        <w:t>Progress on Engineers Day – May 7, 2025</w:t>
+        <w:t>Industrial attachments</w:t>
       </w:r>
     </w:p>
     <w:p>
@@ -306,6 +306,44 @@
         </w:rPr>
         <w:t>4.</w:t>
         <w:tab/>
+        <w:t>Micro credential course</w:t>
+      </w:r>
+    </w:p>
+    <w:p>
+      <w:pPr>
+        <w:tabs>
+          <w:tab w:pos="850" w:val="left"/>
+        </w:tabs>
+        <w:spacing w:after="40" w:before="0"/>
+        <w:ind w:left="850" w:hanging="340"/>
+      </w:pPr>
+      <w:r>
+        <w:rPr>
+          <w:b w:val="0"/>
+          <w:sz w:val="24"/>
+          <w:u w:val="none"/>
+        </w:rPr>
+        <w:t>5.</w:t>
+        <w:tab/>
+        <w:t>Capstone project</w:t>
+      </w:r>
+    </w:p>
+    <w:p>
+      <w:pPr>
+        <w:tabs>
+          <w:tab w:pos="850" w:val="left"/>
+        </w:tabs>
+        <w:spacing w:after="40" w:before="0"/>
+        <w:ind w:left="850" w:hanging="340"/>
+      </w:pPr>
+      <w:r>
+        <w:rPr>
+          <w:b w:val="0"/>
+          <w:sz w:val="24"/>
+          <w:u w:val="none"/>
+        </w:rPr>
+        <w:t>6.</w:t>
+        <w:tab/>
         <w:t>Miscellaneous</w:t>
       </w:r>
     </w:p>
@@ -320,7 +358,7 @@
           <w:sz w:val="24"/>
           <w:u w:val="none"/>
         </w:rPr>
-        <w:t>All faculty members, including the conveners and members of the Engineers Day committees, are cordially requested to attend the meeting on time and provide their valuable opinions and suggestions.</w:t>
+        <w:t>All members are cordially requested to attend the meeting on time and provide their valuable opinions and suggestions.</w:t>
       </w:r>
     </w:p>
     <w:p>

</xml_diff>